<commit_message>
feat: align PDF and PPTX learning flows
</commit_message>
<xml_diff>
--- a/docs/Plan_do_an_tot_nghiep_dong_bo_toan_bo_kien_truc_CSDL_API.docx
+++ b/docs/Plan_do_an_tot_nghiep_dong_bo_toan_bo_kien_truc_CSDL_API.docx
@@ -144,7 +144,7 @@
               <w:rPr>
                 <w:sz w:val="19"/>
               </w:rPr>
-              <w:t>Smart Learning Management / Exam Preparation Platform</w:t>
+              <w:t>Smart Learning Management / AI-assisted Review Platform</w:t>
             </w:r>
           </w:p>
         </w:tc>
@@ -167,7 +167,7 @@
         <w:spacing w:after="100" w:line="276" w:lineRule="auto"/>
       </w:pPr>
       <w:r>
-        <w:t>Đề tài xây dựng một nền tảng web hỗ trợ học tập và ôn luyện cho sinh viên theo mô hình lớp học - môn học. Sinh viên truy cập học liệu do giảng viên public cho đúng lớp/môn; Slide/PPTX được xem trực tiếp trên web, còn PDF được tải về. Sinh viên đồng thời có kho tài liệu cá nhân để upload PDF/DOCX và hỏi đáp bằng AI RAG. Hệ thống còn hỗ trợ Tiến độ &amp; Thống kê, Kế hoạch &amp; Lịch và Ôn thi.</w:t>
+        <w:t>Đề tài xây dựng một nền tảng web hỗ trợ học tập và ôn luyện cho sinh viên theo mô hình lớp học - môn học. Sinh viên truy cập học liệu do giảng viên public cho đúng lớp/môn; Slide/PPTX được xem trực tiếp trên web, còn PDF được tải về. Sinh viên đồng thời có kho tài liệu cá nhân để upload PDF, hỏi đáp bằng AI RAG và tạo Quiz. Hệ thống còn hỗ trợ Tiến độ &amp; Thống kê, Kế hoạch &amp; Lịch và Ôn tập.</w:t>
       </w:r>
     </w:p>
     <w:p>
@@ -175,7 +175,7 @@
         <w:spacing w:after="100" w:line="276" w:lineRule="auto"/>
       </w:pPr>
       <w:r>
-        <w:t>Trọng tâm của sản phẩm là quản lý học liệu, theo dõi hoạt động học và hỗ trợ ôn thi. AI chỉ được dùng tại các điểm cần hiểu nội dung: chatbot RAG trên tài liệu cá nhân của Student và AI Tutor khi Student xem Slide. Các chức năng tiến độ, thống kê, kế hoạch, lịch và trạng thái ôn thi được xử lý bằng backend/database.</w:t>
+        <w:t>Trọng tâm của sản phẩm là quản lý học liệu, theo dõi hoạt động học và hỗ trợ ôn tập. AI được dùng cho chatbot RAG trên tài liệu cá nhân, AI Tutor khi Student xem Slide và sinh bản nháp Quiz có nguồn. Java Spring Boot xử lý phân quyền, tiến độ, thống kê, kế hoạch, lịch, vòng đời Quiz và chấm điểm.</w:t>
       </w:r>
     </w:p>
     <w:p>
@@ -248,7 +248,7 @@
         <w:ind w:left="360" w:hanging="216"/>
       </w:pPr>
       <w:r>
-        <w:t>• Chatbot hỏi đáp tài liệu chỉ giải quyết việc hỏi - đáp; sinh viên vẫn cần một nền tảng kết hợp lớp/môn, học liệu, kế hoạch, lịch và ôn thi.</w:t>
+        <w:t>• Chatbot hỏi đáp tài liệu chỉ giải quyết việc hỏi - đáp; sinh viên vẫn cần một nền tảng kết hợp lớp/môn, học liệu, kế hoạch, lịch và ôn tập.</w:t>
       </w:r>
     </w:p>
     <w:p>
@@ -295,7 +295,7 @@
           <w:rFonts w:ascii="Times New Roman" w:hAnsi="Times New Roman"/>
           <w:sz w:val="24"/>
         </w:rPr>
-        <w:t>• Xây dựng khu vực Tài liệu cá nhân cho Student: chỉ cho phép upload PDF/DOCX; tích hợp chatbot RAG để hỏi đáp trên chính các tài liệu cá nhân do Student tải lên và trả lời kèm citation.</w:t>
+        <w:t>• Xây dựng khu vực Tài liệu cá nhân cho Student: chỉ cho phép upload PDF; tích hợp chatbot RAG để hỏi đáp trên chính các tài liệu cá nhân do Student tải lên và trả lời kèm citation.</w:t>
       </w:r>
     </w:p>
     <w:p>
@@ -331,7 +331,7 @@
         <w:ind w:left="360" w:hanging="216"/>
       </w:pPr>
       <w:r>
-        <w:t>• Xây dựng khu vực Ôn thi trong một module thống nhất: quản lý kỳ thi, countdown, danh sách nội dung cần ôn, tiến độ ôn và Mock Exam; không phụ thuộc chức năng Quiz của Teacher.</w:t>
+        <w:t>• Xây dựng khu vực Ôn tập để quản lý Quiz AI: Student tạo Quiz từ các Personal Documents đang chọn trong chatbot, xem bản nháp, chấp nhận hoặc từ chối, làm Quiz đã sẵn sàng và xem kết quả do Java chấm.</w:t>
       </w:r>
     </w:p>
     <w:p>
@@ -436,7 +436,7 @@
               <w:rPr>
                 <w:sz w:val="20"/>
               </w:rPr>
-              <w:t>Học theo lớp/môn; xem Slide Teacher public trên web và tải PDF; Note + AI Tutor chỉ áp dụng khi xem Slide; quản lý PDF/DOCX cá nhân và chatbot RAG; sử dụng Tiến độ &amp; Thống kê, Kế hoạch &amp; Lịch và Ôn thi.</w:t>
+              <w:t>Học theo lớp/môn; xem Slide Teacher public trên web và tải PDF; Note + AI Tutor chỉ áp dụng khi xem Slide; quản lý PDF cá nhân và chatbot RAG; sử dụng Tiến độ &amp; Thống kê, Kế hoạch &amp; Lịch và Ôn tập.</w:t>
             </w:r>
           </w:p>
         </w:tc>
@@ -526,7 +526,7 @@
         <w:spacing w:after="100" w:line="276" w:lineRule="auto"/>
       </w:pPr>
       <w:r>
-        <w:t>Luồng học liệu chính: Student → Lớp học &amp; Môn học → chọn lớp → chọn môn → xem danh sách Tài liệu Teacher đã public. Slide/PPTX được sắp xếp trước PDF. Slide được xem trực tiếp trên web, có Note và AI Tutor khi đang xem; không cho tải file slide. PDF chỉ hiển thị trong danh sách Tài liệu để Student tải về, không xem trên web, không có Note và không dùng AI Tutor.</w:t>
+        <w:t>Luồng học liệu chính: Student → Lớp học &amp; Môn học → chọn lớp → chọn môn → xem danh sách Tài liệu Teacher đã public. Slide/PPTX được sắp xếp trước PDF. Slide được xem trực tiếp trên web, có Note và AI Tutor khi đang xem; không cho tải file PPTX gốc. PDF chỉ hiển thị để Student tải về, không có viewer, Note hoặc AI Tutor.</w:t>
       </w:r>
     </w:p>
     <w:p>
@@ -534,7 +534,7 @@
         <w:spacing w:after="100" w:line="276" w:lineRule="auto"/>
       </w:pPr>
       <w:r>
-        <w:t>Luồng ôn thi: Student → Ôn thi → tạo kỳ thi/ngày thi → thêm nội dung cần ôn → theo dõi countdown và tiến độ → làm Mock Exam trong cùng module khi có bộ đề → hệ thống lưu attempt/answer/kết quả → Student tiếp tục điều chỉnh kế hoạch ôn tập.</w:t>
+        <w:t>Luồng ôn tập: Student chọn một hoặc nhiều Personal Documents READY trong chatbot → yêu cầu tạo Quiz → hệ thống sinh Quiz MCQ_SINGLE ở trạng thái REVIEW_REQUIRED → Student xem nguồn và chấp nhận → Quiz chuyển READY → Student làm bài → Java chấm điểm và lưu attempt/answer/kết quả.</w:t>
       </w:r>
     </w:p>
     <w:p>
@@ -546,7 +546,7 @@
           <w:rFonts w:ascii="Times New Roman" w:hAnsi="Times New Roman"/>
           <w:sz w:val="24"/>
         </w:rPr>
-        <w:t>Luồng tài liệu cá nhân: Student → Tài liệu cá nhân → upload PDF/DOCX → hệ thống lưu file, extract text, chunking, embedding và index bằng PostgreSQL + pgvector → Student chọn một hoặc nhiều tài liệu cá nhân → Chatbot RAG hỏi đáp → trả lời kèm nguồn. Chatbot bên ngoài không truy xuất học liệu Teacher giao trong Lớp học.</w:t>
+        <w:t>Luồng tài liệu cá nhân: Student → Tài liệu cá nhân → upload PDF → hệ thống lưu file, extract text, chunking, embedding và index bằng PostgreSQL + pgvector → Student chọn một hoặc nhiều tài liệu cá nhân → Chatbot RAG hỏi đáp → trả lời kèm nguồn. Chatbot bên ngoài không truy xuất học liệu Teacher giao trong Lớp học.</w:t>
       </w:r>
     </w:p>
     <w:p>
@@ -771,7 +771,7 @@
               <w:rPr>
                 <w:sz w:val="20"/>
               </w:rPr>
-              <w:t>Slide/PPTX: xem trực tiếp trên web, không tải xuống; khi xem có Note theo từng slide và AI Tutor. PDF: chỉ hiển thị trong danh sách để tải xuống, không xem trên web, không có Note và không dùng AI Tutor.</w:t>
+              <w:t>Slide/PPTX: xem trực tiếp trên web, không tải file gốc; khi xem có Note theo từng slide và AI Tutor. PDF: chỉ hiển thị trong danh sách để tải xuống, không có viewer, Note hoặc AI Tutor.</w:t>
             </w:r>
           </w:p>
         </w:tc>
@@ -821,7 +821,7 @@
               <w:rPr>
                 <w:sz w:val="20"/>
               </w:rPr>
-              <w:t>Student chỉ upload PDF/DOCX. Gồm Kho tài liệu và Hỏi đáp AI; chatbot RAG chỉ truy xuất các tài liệu cá nhân do chính Student chọn.</w:t>
+              <w:t>Student chỉ upload PDF. Gồm Kho tài liệu và Hỏi đáp AI; chatbot RAG chỉ truy xuất các tài liệu cá nhân do chính Student chọn.</w:t>
             </w:r>
           </w:p>
         </w:tc>
@@ -955,7 +955,7 @@
               <w:rPr>
                 <w:sz w:val="20"/>
               </w:rPr>
-              <w:t>Ôn thi</w:t>
+              <w:t>Ôn tập</w:t>
             </w:r>
           </w:p>
         </w:tc>
@@ -971,7 +971,7 @@
               <w:rPr>
                 <w:sz w:val="20"/>
               </w:rPr>
-              <w:t>Gộp Exam Workspace và Mock Exam. Student tạo kỳ thi/phạm vi ôn, theo dõi countdown/tiến độ và thực hiện thi thử trong cùng một khu vực.</w:t>
+              <w:t>Quản lý Quiz AI được sinh từ Personal Documents trong chatbot. Student xem bản nháp, chấp nhận hoặc từ chối; chỉ Quiz READY mới được làm. Mỗi câu có nhiều lựa chọn nhưng đúng một đáp án và Java chịu trách nhiệm chấm điểm.</w:t>
             </w:r>
           </w:p>
         </w:tc>
@@ -1199,7 +1199,7 @@
               <w:rPr>
                 <w:sz w:val="20"/>
               </w:rPr>
-              <w:t>Upload và quản lý học liệu PDF, PPTX, DOCX trong kho của Teacher. Tài liệu mới upload được lưu trong kho và chưa hiển thị cho Student.</w:t>
+              <w:t>Upload và quản lý học liệu PDF, PPTX trong kho của Teacher. Tài liệu mới upload được lưu trong kho và chưa hiển thị cho Student.</w:t>
             </w:r>
           </w:p>
         </w:tc>
@@ -1258,7 +1258,7 @@
     <w:p>
       <w:pPr/>
       <w:r>
-        <w:t>Luồng Teacher chính: Teacher → Kho tài liệu → upload PDF/PPTX/DOCX → chọn tài liệu → chọn Lớp + Môn đang phụ trách → Public. Sau khi public, Student của lớp/môn đó nhìn thấy tài liệu. Teacher có thể xem nơi tài liệu đã được public và thu hồi public khi cần.</w:t>
+        <w:t>Luồng Teacher chính: Teacher → Kho tài liệu → upload PDF/PPTX → chọn tài liệu → chọn Lớp + Môn đang phụ trách → Public. Sau khi public, Student của lớp/môn đó nhìn thấy tài liệu. Teacher có thể xem nơi tài liệu đã được public và thu hồi public khi cần.</w:t>
       </w:r>
     </w:p>
     <w:p>
@@ -1838,7 +1838,7 @@
               <w:rPr>
                 <w:sz w:val="20"/>
               </w:rPr>
-              <w:t>Student UI, Teacher UI, Admin UI; Lớp học &amp; Môn học, danh sách Tài liệu, Slide Viewer có Note + AI Tutor, Tài liệu cá nhân + RAG Chat, Tiến độ &amp; Thống kê, Kế hoạch &amp; Lịch và Ôn thi.</w:t>
+              <w:t>Student UI, Teacher UI, Admin UI; Lớp học &amp; Môn học, danh sách Tài liệu, Slide Viewer có Note + AI Tutor, Tài liệu cá nhân + RAG Chat + tạo Quiz, Tiến độ &amp; Thống kê, Kế hoạch &amp; Lịch và Ôn tập.</w:t>
             </w:r>
           </w:p>
         </w:tc>
@@ -1866,7 +1866,7 @@
               <w:rPr>
                 <w:sz w:val="20"/>
               </w:rPr>
-              <w:t>API nghiệp vụ trung tâm: Auth/JWT/RBAC, User, lớp/môn, phân công Teacher, tài liệu/public, Note, tiến độ/thống kê, kế hoạch/lịch, ôn thi, logging và kiểm tra quyền trước khi gọi AI Service.</w:t>
+              <w:t>API nghiệp vụ trung tâm: Auth/JWT/RBAC, User, lớp/môn, phân công Teacher, tài liệu/public, Note, tiến độ/thống kê, kế hoạch/lịch, vòng đời Quiz, attempt/scoring, logging và kiểm tra quyền trước khi gọi AI Service.</w:t>
             </w:r>
           </w:p>
         </w:tc>
@@ -1894,7 +1894,7 @@
               <w:rPr>
                 <w:sz w:val="20"/>
               </w:rPr>
-              <w:t>Microservice AI riêng: extract text, chunking, embedding, pgvector retrieval, RAG, prompt/LLM, citation và AI Tutor. Không đảm nhiệm CRUD nghiệp vụ chính.</w:t>
+              <w:t>Microservice AI riêng: extract text, chunking, embedding, pgvector retrieval, RAG, prompt/LLM, citation, AI Tutor và sinh bản nháp Quiz có cấu trúc. Python không sở hữu vòng đời Quiz, progress, study plan hoặc scoring.</w:t>
             </w:r>
           </w:p>
         </w:tc>
@@ -1922,7 +1922,7 @@
               <w:rPr>
                 <w:sz w:val="20"/>
               </w:rPr>
-              <w:t>Teacher: lưu PDF/PPTX/DOCX; PPTX được extract/render để xem Slide trên web. Student Personal Documents: PDF/DOCX được parsing, chunking và indexing để phục vụ RAG.</w:t>
+              <w:t>Teacher: lưu PDF/PPTX; PPTX được extract/render để xem Slide trên web. Student Personal Documents: PDF được parsing, chunking và indexing để phục vụ RAG.</w:t>
             </w:r>
           </w:p>
         </w:tc>
@@ -1986,7 +1986,7 @@
     </w:tbl>
     <w:p>
       <w:r>
-        <w:t>Hệ thống tách thành ba lớp chính: Next.js Frontend, Java Spring Boot Backend và Python FastAPI AI Service. Frontend chỉ giao tiếp với Spring Boot cho nghiệp vụ chính. Spring Boot chịu trách nhiệm xác thực, phân quyền, CRUD và kiểm tra ownership/scope; khi cần AI, Spring Boot gọi FastAPI qua internal REST API. FastAPI tập trung xử lý document AI, embedding, pgvector retrieval, RAG, LLM và citation.</w:t>
+        <w:t>Hệ thống tách thành ba lớp chính: Next.js Frontend, Java Spring Boot Backend và Python FastAPI AI Service. Frontend chỉ giao tiếp với Spring Boot. Spring Boot chịu trách nhiệm xác thực, phân quyền, CRUD, ownership/scope, vòng đời Quiz và scoring; khi cần xử lý tài liệu hoặc AI, Spring Boot gọi FastAPI qua internal REST API. FastAPI xử lý parsing/rendering, embedding, pgvector retrieval, RAG, citation, Slide Tutor và sinh bản nháp Quiz có cấu trúc.</w:t>
       </w:r>
     </w:p>
     <w:p>
@@ -2010,7 +2010,7 @@
         <w:spacing w:after="100" w:line="276" w:lineRule="auto"/>
       </w:pPr>
       <w:r>
-        <w:t>Có hai ngữ cảnh AI Tutor: (1) chatbot trong Tài liệu cá nhân chỉ hỏi trên PDF/DOCX do chính Student upload; (2) AI Tutor của học liệu lớp chỉ xuất hiện khi Student đang xem Slide/PPTX Teacher đã public. AI Tutor không áp dụng cho PDF Teacher public. Backend phải kiểm tra quyền truy cập và giới hạn retrieval đúng phạm vi tài liệu.</w:t>
+        <w:t>Có hai ngữ cảnh AI Tutor: (1) chatbot trong Tài liệu cá nhân chỉ hỏi trên PDF do chính Student upload; (2) AI Tutor của học liệu lớp chỉ xuất hiện khi Student đang xem Slide/PPTX Teacher đã public. AI Tutor không áp dụng cho PDF Teacher public. Backend phải kiểm tra quyền truy cập và giới hạn retrieval đúng phạm vi tài liệu.</w:t>
       </w:r>
     </w:p>
     <w:p>
@@ -2032,7 +2032,7 @@
         <w:spacing w:after="100" w:line="276" w:lineRule="auto"/>
       </w:pPr>
       <w:r>
-        <w:t>Python AI Service chỉ xử lý các tác vụ cần hiểu nội dung tài liệu như extraction, chunking, embedding, retrieval, RAG, LLM và citation. Các nghiệp vụ như xác thực, phân quyền, lớp/môn, public tài liệu, Note, tiến độ, thống kê, kế hoạch, lịch và exam do Java Spring Boot xử lý để dễ kiểm thử và tách rõ trách nhiệm.</w:t>
+        <w:t>Python AI Service chỉ xử lý các tác vụ cần hiểu nội dung tài liệu như extraction/rendering, chunking, embedding, retrieval, RAG, LLM, citation và sinh bản nháp Quiz. Các nghiệp vụ xác thực, phân quyền, lớp/môn, public tài liệu, Note, tiến độ, thống kê, kế hoạch, lịch, vòng đời Quiz và chấm điểm do Java Spring Boot xử lý.</w:t>
       </w:r>
     </w:p>
     <w:p>
@@ -2072,7 +2072,7 @@
         <w:spacing w:after="100" w:line="276" w:lineRule="auto"/>
       </w:pPr>
       <w:r>
-        <w:t>Thống kê tổng hợp các dữ liệu phù hợp như số Slide đã xem, số tài liệu cá nhân, số kế hoạch đã hoàn thành và tiến độ ôn thi. Không sử dụng Topic Mastery trong phạm vi hiện tại vì hệ thống chưa tổ chức học liệu theo nội dung và chưa triển khai Quiz của Teacher.</w:t>
+        <w:t>Thống kê tổng hợp số Slide đã xem, số tài liệu cá nhân, số kế hoạch đã hoàn thành, số Quiz đã chấp nhận/đã làm và điểm trung bình. Không sử dụng Topic Mastery trong MVP vì hệ thống chưa có Chapter/Topic taxonomy.</w:t>
       </w:r>
     </w:p>
     <w:p>
@@ -2112,7 +2112,7 @@
         <w:spacing w:after="100" w:line="276" w:lineRule="auto"/>
       </w:pPr>
       <w:r>
-        <w:t>Các sự kiện chính có thể gồm VIEW_SLIDE, NOTE_SAVED, PERSONAL_DOCUMENT_UPLOADED, PERSONAL_DOCUMENT_INDEXED, ASK_AI, STUDY_PLAN_CREATED/COMPLETED và EXAM_CREATED. Learning Events hỗ trợ cập nhật tiến độ, thống kê và audit.</w:t>
+        <w:t>Các sự kiện chính có thể gồm VIEW_SLIDE, NOTE_SAVED, PERSONAL_DOCUMENT_UPLOADED, PERSONAL_DOCUMENT_INDEXED, ASK_AI, STUDY_PLAN_CREATED/COMPLETED, QUIZ_GENERATED, QUIZ_ACCEPTED và QUIZ_COMPLETED. Learning Events hỗ trợ cập nhật tiến độ, thống kê và audit.</w:t>
       </w:r>
     </w:p>
     <w:p>
@@ -2125,7 +2125,7 @@
     </w:p>
     <w:p>
       <w:r>
-        <w:t>CSDL dùng PostgreSQL làm nguồn dữ liệu trung tâm cho nghiệp vụ; pgvector là extension trong cùng PostgreSQL để lưu embedding. Spring Boot sở hữu các bảng nghiệp vụ và kiểm soát transaction/quyền truy cập. Python FastAPI AI Service chỉ xử lý pipeline AI và truy cập các dữ liệu AI cần thiết theo contract nội bộ. File gốc, bản render Slide và tài nguyên lớn được lưu ở Object Storage; CSDL chỉ lưu metadata, quan hệ và đường dẫn.</w:t>
+        <w:t>PostgreSQL là nguồn dữ liệu trung tâm và pgvector là extension trong cùng một cluster. Java/Flyway sở hữu schema app cho dữ liệu nghiệp vụ; Python/Alembic sở hữu schema ai cho job, chunk và embedding. Hai service dùng database role riêng; Java không đọc/ghi vector trực tiếp và Python không truy cập trực tiếp bảng user, membership, plan, Quiz attempt hoặc result. File gốc, bản render Slide và tài nguyên lớn được lưu ở Object Storage.</w:t>
       </w:r>
     </w:p>
     <w:tbl>
@@ -2408,7 +2408,7 @@
               <w:rPr>
                 <w:sz w:val="19"/>
               </w:rPr>
-              <w:t>Metadata tài liệu của Teacher và Student: owner_id, file_name, file_type, storage_path, file_size, document_scope, processing_status, created_at. Student Personal Documents chỉ PDF/DOCX; Teacher có thể PDF/PPTX/DOCX.</w:t>
+              <w:t>Metadata tài liệu của Teacher và Student: owner_id, file_name, file_type, storage_path, file_size, document_scope, processing_status, created_at. Student Personal Documents chỉ PDF; Teacher có thể PDF/PPTX.</w:t>
             </w:r>
           </w:p>
         </w:tc>
@@ -2528,7 +2528,7 @@
               <w:rPr>
                 <w:sz w:val="19"/>
               </w:rPr>
-              <w:t>document_chunks</w:t>
+              <w:t>ai.index_jobs / ai.document_indexes</w:t>
             </w:r>
           </w:p>
         </w:tc>
@@ -2544,7 +2544,7 @@
               <w:rPr>
                 <w:sz w:val="19"/>
               </w:rPr>
-              <w:t>Chunk phục vụ AI: document_id, user_id/owner scope, source_type, page_number hoặc slide_number, chunk_index, content và embedding VECTOR(...). Chủ yếu dùng cho Personal Document RAG và nội dung Slide cần AI Tutor; PDF Teacher không cần index.</w:t>
+              <w:t>Python quản lý job index/deindex idempotent và version index đang active: request_id, idempotency_key, document_id, document_version, pipeline_type, status, attempts, embedding_model, dimensions và timestamps.</w:t>
             </w:r>
           </w:p>
         </w:tc>
@@ -2562,7 +2562,7 @@
               <w:rPr>
                 <w:sz w:val="19"/>
               </w:rPr>
-              <w:t>chat_conversations</w:t>
+              <w:t>ai.document_chunks</w:t>
             </w:r>
           </w:p>
         </w:tc>
@@ -2578,7 +2578,7 @@
               <w:rPr>
                 <w:sz w:val="19"/>
               </w:rPr>
-              <w:t>Phiên hội thoại AI của Student; phân biệt PERSONAL_RAG và SLIDE_TUTOR, gắn user_id và context/document phù hợp.</w:t>
+              <w:t>Chunk phục vụ AI: document_id, document_version, owner_id, source_type, page_number hoặc slide_number, chunk_index, content và embedding vector(...). Retrieval luôn filter đúng owner, document/version và authorized scope do Java cấp.</w:t>
             </w:r>
           </w:p>
         </w:tc>
@@ -2596,7 +2596,7 @@
               <w:rPr>
                 <w:sz w:val="19"/>
               </w:rPr>
-              <w:t>chat_messages</w:t>
+              <w:t>chat_conversations / chat_messages</w:t>
             </w:r>
           </w:p>
         </w:tc>
@@ -2612,7 +2612,7 @@
               <w:rPr>
                 <w:sz w:val="19"/>
               </w:rPr>
-              <w:t>Tin nhắn trong hội thoại AI: conversation_id, role, content, citation/source metadata và created_at.</w:t>
+              <w:t>Java sở hữu metadata hội thoại và message của Student, gồm loại PERSONAL_RAG|SLIDE_TUTOR, context được phép, role, content, citation và timestamps; nội dung không được sao chép vào system log.</w:t>
             </w:r>
           </w:p>
         </w:tc>
@@ -2732,7 +2732,7 @@
               <w:rPr>
                 <w:sz w:val="19"/>
               </w:rPr>
-              <w:t>exams</w:t>
+              <w:t>quizzes</w:t>
             </w:r>
           </w:p>
         </w:tc>
@@ -2748,7 +2748,7 @@
               <w:rPr>
                 <w:sz w:val="19"/>
               </w:rPr>
-              <w:t>Thông tin kỳ thi/đợt ôn của Student: subject/class_subject, exam_name, exam_date, description và status.</w:t>
+              <w:t>Quiz AI thuộc Student: title, description, generation_type=AI_PERSONAL_RAG, question_count, status GENERATING|REVIEW_REQUIRED|READY|REJECTED|GENERATION_FAILED|ARCHIVED và timestamps. Java sở hữu vòng đời Quiz.</w:t>
             </w:r>
           </w:p>
         </w:tc>
@@ -2766,7 +2766,7 @@
               <w:rPr>
                 <w:sz w:val="19"/>
               </w:rPr>
-              <w:t>exam_items</w:t>
+              <w:t>quiz_sources</w:t>
             </w:r>
           </w:p>
         </w:tc>
@@ -2782,7 +2782,7 @@
               <w:rPr>
                 <w:sz w:val="19"/>
               </w:rPr>
-              <w:t>Các mục cần ôn trong một kỳ thi: exam_id, title/content, status, priority và progress; dùng cho khu vực Ôn thi.</w:t>
+              <w:t>Nguồn sinh Quiz: quiz_id, document_id và document_version. Chỉ liên kết Personal Documents thuộc Student và đã được chọn trong conversation; unique theo quiz_id + document_id.</w:t>
             </w:r>
           </w:p>
         </w:tc>
@@ -2899,7 +2899,7 @@
               <w:rPr>
                 <w:sz w:val="19"/>
               </w:rPr>
-              <w:t>mock_exams</w:t>
+              <w:t>quiz_questions</w:t>
             </w:r>
           </w:p>
         </w:tc>
@@ -2912,7 +2912,7 @@
               <w:rPr>
                 <w:sz w:val="19"/>
               </w:rPr>
-              <w:t>Bộ đề thi thử trong module Ôn thi; gắn class_subject/subject, title, duration, status và nguồn bộ đề. Không phải Quiz do Teacher tạo/giao.</w:t>
+              <w:t>Câu hỏi Quiz: quiz_id, content, question_type=MCQ_SINGLE, options, correct_option_index, explanation và display_order. Mỗi câu có tối thiểu hai lựa chọn khác nhau và đúng một đáp án đúng.</w:t>
             </w:r>
           </w:p>
         </w:tc>
@@ -2927,7 +2927,7 @@
               <w:rPr>
                 <w:sz w:val="19"/>
               </w:rPr>
-              <w:t>mock_exam_questions</w:t>
+              <w:t>quiz_question_sources</w:t>
             </w:r>
           </w:p>
         </w:tc>
@@ -2940,7 +2940,7 @@
               <w:rPr>
                 <w:sz w:val="19"/>
               </w:rPr>
-              <w:t>Câu hỏi của bộ đề thi thử: mock_exam_id, question_type, content, options, correct_answer/answer_key, explanation và score.</w:t>
+              <w:t>Citation của câu hỏi: question_id, document_id, location_kind, location_value và excerpt. Java đối chiếu document/version với authorized scope trước khi lưu.</w:t>
             </w:r>
           </w:p>
         </w:tc>
@@ -2955,7 +2955,7 @@
               <w:rPr>
                 <w:sz w:val="19"/>
               </w:rPr>
-              <w:t>mock_exam_attempts</w:t>
+              <w:t>quiz_attempts</w:t>
             </w:r>
           </w:p>
         </w:tc>
@@ -2968,7 +2968,7 @@
               <w:rPr>
                 <w:sz w:val="19"/>
               </w:rPr>
-              <w:t>Lần Student làm Mock Exam: mock_exam_id, student_id, started_at, submitted_at, score, status và duration_used.</w:t>
+              <w:t>Lần Student làm Quiz: quiz_id, student_id, started_at, submitted_at, total_score, status IN_PROGRESS|SUBMITTED|SCORED|ABANDONED và duration. Chỉ Quiz READY mới tạo được attempt.</w:t>
             </w:r>
           </w:p>
         </w:tc>
@@ -2983,7 +2983,7 @@
               <w:rPr>
                 <w:sz w:val="19"/>
               </w:rPr>
-              <w:t>mock_exam_answers</w:t>
+              <w:t>quiz_answers</w:t>
             </w:r>
           </w:p>
         </w:tc>
@@ -2996,7 +2996,7 @@
               <w:rPr>
                 <w:sz w:val="19"/>
               </w:rPr>
-              <w:t>Câu trả lời theo attempt + question; lưu selected_answer/text_answer, is_correct và score_awarded để xem kết quả.</w:t>
+              <w:t>Câu trả lời theo attempt + question: selected_option_id, is_correct và awarded_score; unique theo attempt_id + question_id. Java khóa answer và chấm điểm khi submit.</w:t>
             </w:r>
           </w:p>
         </w:tc>
@@ -3036,7 +3036,7 @@
     </w:p>
     <w:p>
       <w:r>
-        <w:t>• Khóa ngoại/unique/index ưu tiên cho users(email/username), class_students(class_id,student_id), class_subjects(class_id,subject_id,semester,academic_year), document_publications(document_id,class_subject_id), slides(document_id,slide_number), slide_notes(user_id,document_id,slide_number), mock_exam_answers(attempt_id,question_id) và vector index của document_chunks.</w:t>
+        <w:t>• Khóa ngoại/unique/index ưu tiên cho users(email/username), class_students(class_id,student_id), class_subjects(class_id,subject_id,semester,academic_year), document_publications(document_id,class_subject_id), slides(document_id,slide_number), slide_notes(user_id,document_id,slide_number), quiz_sources(quiz_id,document_id), quiz_answers(attempt_id,question_id) và vector index của document_chunks.</w:t>
       </w:r>
     </w:p>
     <w:p/>
@@ -3214,7 +3214,7 @@
               <w:rPr>
                 <w:sz w:val="20"/>
               </w:rPr>
-              <w:t>Spring Boot: danh sách tài liệu của môn, quyền truy cập, mở Slide trên web, tải PDF và không cung cấp download PPTX.</w:t>
+              <w:t>Spring Boot: danh sách tài liệu của môn, quyền truy cập, mở Slide trên web, tải PDF và không cung cấp download PPTX gốc.</w:t>
             </w:r>
           </w:p>
         </w:tc>
@@ -3356,7 +3356,7 @@
               <w:rPr>
                 <w:sz w:val="20"/>
               </w:rPr>
-              <w:t>Ôn thi</w:t>
+              <w:t>Ôn tập và Quiz</w:t>
             </w:r>
           </w:p>
         </w:tc>
@@ -3369,7 +3369,7 @@
               <w:rPr>
                 <w:sz w:val="19"/>
               </w:rPr>
-              <w:t>Spring Boot: CRUD exam/exam_items, countdown, tiến độ ôn; Mock Exam gồm bộ đề, câu hỏi, attempt, answer và kết quả trong cùng module.</w:t>
+              <w:t>Spring Boot: danh sách Quiz theo trạng thái, duyệt/từ chối bản nháp, chỉ cho tạo attempt khi Quiz READY, lưu một selectedOptionId cho mỗi câu, submit idempotent và chấm điểm trong transaction. Python chỉ sinh câu hỏi MCQ_SINGLE có nguồn theo authorized Personal Documents.</w:t>
             </w:r>
           </w:p>
         </w:tc>
@@ -3428,7 +3428,7 @@
               <w:rPr>
                 <w:sz w:val="19"/>
               </w:rPr>
-              <w:t>Spring Boot → Python FastAPI: /internal/ai/index, /internal/ai/chat, /internal/ai/slide-tutor. Chỉ dùng cho xử lý AI; không dùng để CRUD lớp/môn, public tài liệu, Note, kế hoạch hay kỳ thi.</w:t>
+              <w:t>Spring Boot → Python FastAPI qua POST /internal/v1/documents/index, POST /internal/v1/documents/deindex, GET /internal/v1/jobs/{jobId}, POST /internal/v1/personal-rag/ask, POST /internal/v1/slides/ask, POST /internal/v1/quizzes/generate và GET /internal/v1/health. Mỗi request có service credential, X-Request-Id, X-Schema-Version: 2, authorized scope tối thiểu, timeout và idempotency key khi phù hợp.</w:t>
             </w:r>
           </w:p>
         </w:tc>
@@ -3453,7 +3453,7 @@
           <w:rFonts w:ascii="Times New Roman" w:hAnsi="Times New Roman"/>
           <w:sz w:val="24"/>
         </w:rPr>
-        <w:t>• Bảo mật: JWT/session phù hợp, hash password, RBAC STUDENT/TEACHER/ADMIN, kiểm tra scope/ownership, validate upload; tài liệu cá nhân Student chỉ hỗ trợ PDF/DOCX và không để lộ API key.</w:t>
+        <w:t>• Bảo mật: JWT/session phù hợp, hash password, RBAC STUDENT/TEACHER/ADMIN, kiểm tra scope/ownership, validate upload; tài liệu cá nhân Student chỉ hỗ trợ PDF và không để lộ API key.</w:t>
       </w:r>
     </w:p>
     <w:p>
@@ -3691,7 +3691,7 @@
               <w:rPr>
                 <w:sz w:val="20"/>
               </w:rPr>
-              <w:t>PostgreSQL + pgvector; không dùng Qdrant/Milvus trong thiết kế hiện tại.</w:t>
+              <w:t>Một PostgreSQL cluster, tách schema app và ai; schema ai dùng pgvector. Không dùng Qdrant/Milvus trong thiết kế hiện tại.</w:t>
             </w:r>
           </w:p>
         </w:tc>
@@ -3784,7 +3784,7 @@
               <w:rPr>
                 <w:sz w:val="20"/>
               </w:rPr>
-              <w:t>Object Storage cho file PDF/PPTX/DOCX.</w:t>
+              <w:t>Object Storage cho file PDF/PPTX.</w:t>
             </w:r>
           </w:p>
         </w:tc>
@@ -3815,7 +3815,7 @@
               <w:rPr>
                 <w:sz w:val="20"/>
               </w:rPr>
-              <w:t>Python: PDF/DOCX parsing, chunking/embedding cho Personal Documents; PPTX extraction/rendering phục vụ Slide và AI Tutor.</w:t>
+              <w:t>Python: PDF parsing, chunking/embedding cho Personal Documents; PPTX extraction/rendering phục vụ Slide và AI Tutor.</w:t>
             </w:r>
           </w:p>
         </w:tc>
@@ -3946,7 +3946,7 @@
         <w:ind w:left="360" w:hanging="216"/>
       </w:pPr>
       <w:r>
-        <w:t>• Upload/public tài liệu, Slide Viewer, Note, AI Tutor, Personal Document RAG, Tiến độ &amp; Thống kê, Kế hoạch &amp; Lịch và Ôn thi chạy trên môi trường deploy.</w:t>
+        <w:t>• Upload/public tài liệu, Slide Viewer, Note, AI Tutor, Personal Document RAG, tạo/duyệt/làm Quiz, Tiến độ &amp; Thống kê, Kế hoạch &amp; Lịch và Ôn tập chạy trên môi trường deploy.</w:t>
       </w:r>
     </w:p>
     <w:p>
@@ -4135,7 +4135,7 @@
               <w:rPr>
                 <w:sz w:val="20"/>
               </w:rPr>
-              <w:t>Tập trung lớp/môn, học liệu, tài liệu cá nhân, AI hỗ trợ đọc Slide/RAG, tiến độ, kế hoạch, lịch và ôn thi.</w:t>
+              <w:t>Tập trung lớp/môn, học liệu, tài liệu cá nhân, AI hỗ trợ đọc Slide/RAG và sinh Quiz, tiến độ, kế hoạch, lịch và ôn tập.</w:t>
             </w:r>
           </w:p>
         </w:tc>
@@ -4279,7 +4279,7 @@
         <w:ind w:left="360" w:hanging="216"/>
       </w:pPr>
       <w:r>
-        <w:t>• Lớp học &amp; Môn học: Student vào lớp → chọn môn → xem một danh sách Tài liệu chung. Slide/PPTX xếp trước PDF; Slide xem trực tiếp trên web, PDF chỉ tải xuống.</w:t>
+        <w:t>• Lớp học &amp; Môn học: Student vào lớp → chọn môn → xem một danh sách Tài liệu chung. Slide/PPTX xếp trước PDF; Slide xem trực tiếp trên web, còn PDF chỉ tải xuống.</w:t>
       </w:r>
     </w:p>
     <w:p>
@@ -4292,7 +4292,7 @@
           <w:rFonts w:ascii="Times New Roman" w:hAnsi="Times New Roman"/>
           <w:sz w:val="24"/>
         </w:rPr>
-        <w:t>• Tài liệu cá nhân Student: upload PDF/DOCX, quản lý file và chatbot RAG hỏi đáp trên một/nhiều tài liệu cá nhân có citation.</w:t>
+        <w:t>• Tài liệu cá nhân Student: upload PDF, quản lý file và chatbot RAG hỏi đáp trên một/nhiều tài liệu cá nhân có citation.</w:t>
       </w:r>
     </w:p>
     <w:p>
@@ -4346,7 +4346,7 @@
         <w:ind w:left="360" w:hanging="216"/>
       </w:pPr>
       <w:r>
-        <w:t>• Ôn thi: một module gồm kỳ thi, countdown, nội dung cần ôn, tiến độ và Mock Exam; Mock Exam độc lập với chức năng tạo/giao Quiz của Teacher.</w:t>
+        <w:t>• Ôn tập: Student tạo Quiz AI từ Personal Documents đang chọn trong chatbot; Quiz dùng MCQ_SINGLE, xuất hiện ở trạng thái chờ duyệt và chỉ được làm sau khi Student chấp nhận. Java quản lý vòng đời, attempt, answer và scoring.</w:t>
       </w:r>
     </w:p>
     <w:p>
@@ -4376,7 +4376,7 @@
         <w:ind w:left="360" w:hanging="216"/>
       </w:pPr>
       <w:r>
-        <w:t>• Vision/OCR cho hình, biểu đồ, công thức và sơ đồ trong tài liệu; có thể mở rộng thêm định dạng Personal Documents khi có nhu cầu.</w:t>
+        <w:t>• Exam Workspace, countdown, nội dung cần ôn và Mock Exam được để ở Future Work; không thuộc MVP hiện tại.</w:t>
       </w:r>
     </w:p>
     <w:p>
@@ -4398,7 +4398,7 @@
         <w:ind w:left="360" w:hanging="216"/>
       </w:pPr>
       <w:r>
-        <w:t>• Đồng bộ Google Calendar/notification, flashcard và spaced repetition nâng cao.</w:t>
+        <w:t>• Quiz do Teacher tạo/giao, đồng bộ Google Calendar và notification.</w:t>
       </w:r>
     </w:p>
     <w:p>
@@ -4617,7 +4617,7 @@
               <w:rPr>
                 <w:sz w:val="20"/>
               </w:rPr>
-              <w:t>Spring Boot: Teacher Document Library + Public &amp; Quản lý tài liệu theo Lớp + Môn; Frontend hiển thị danh sách tài liệu với PPTX trước PDF.</w:t>
+              <w:t>Spring Boot: Teacher Document Library + public/thu hồi theo Lớp + Môn; Frontend hiển thị danh sách tài liệu với PPTX trước PDF.</w:t>
             </w:r>
           </w:p>
         </w:tc>
@@ -4803,7 +4803,7 @@
               <w:rPr>
                 <w:sz w:val="19"/>
               </w:rPr>
-              <w:t>Spring Boot + Frontend: Ôn thi gồm exams/exam_items, countdown/progress và Mock Exam với mock_exams, questions, attempts, answers.</w:t>
+              <w:t>Spring Boot + Frontend + Python: sinh Quiz MCQ_SINGLE từ Personal RAG, lưu REVIEW_REQUIRED, màn Quản lý Quiz trong Ôn tập, accept/reject, attempt/answer và Java scoring.</w:t>
             </w:r>
           </w:p>
         </w:tc>
@@ -5002,7 +5002,7 @@
               <w:rPr>
                 <w:sz w:val="19"/>
               </w:rPr>
-              <w:t>Spring Boot: documents/document_publications, upload + Object Storage, Slide/Slide Note, Learning Progress, Study Plan &amp; Calendar, Exams + Mock Exam, feedback/logs; tích hợp internal API gọi Python AI Service.</w:t>
+              <w:t>Spring Boot: documents/document_publications, upload + Object Storage, Slide/Slide Note, Learning Progress, Study Plan &amp; Calendar, Quiz lifecycle + attempt/scoring, feedback/logs; tích hợp internal API gọi Python AI Service.</w:t>
             </w:r>
           </w:p>
         </w:tc>
@@ -5149,7 +5149,7 @@
               <w:rPr>
                 <w:sz w:val="20"/>
               </w:rPr>
-              <w:t>Chỉ retrieval trên PDF/DOCX Student sở hữu/đã chọn; relevance, faithfulness, citation correctness, ownership isolation và latency.</w:t>
+              <w:t>Chỉ retrieval trên PDF Student sở hữu/đã chọn; relevance, faithfulness, citation correctness, ownership isolation và latency.</w:t>
             </w:r>
           </w:p>
         </w:tc>
@@ -5251,7 +5251,7 @@
               <w:rPr>
                 <w:sz w:val="20"/>
               </w:rPr>
-              <w:t>PPTX xếp trước PDF; Slide xem web, không tải; PDF chỉ tải xuống, không Note và không AI Tutor.</w:t>
+              <w:t>PPTX xếp trước PDF; Slide xem trên web, không tải file gốc; PDF chỉ tải xuống, không có Note hoặc AI Tutor.</w:t>
             </w:r>
           </w:p>
         </w:tc>
@@ -5371,7 +5371,7 @@
               <w:rPr>
                 <w:sz w:val="20"/>
               </w:rPr>
-              <w:t>Ôn thi</w:t>
+              <w:t>Ôn tập và Quiz</w:t>
             </w:r>
           </w:p>
         </w:tc>
@@ -5384,7 +5384,7 @@
               <w:rPr>
                 <w:sz w:val="19"/>
               </w:rPr>
-              <w:t>Exam countdown, exam_items/progress và Mock Exam hoạt động trong một module; attempt/answer/score được lưu đúng theo Student và bộ đề.</w:t>
+              <w:t>Quiz AI được sinh từ đúng Personal Documents đã chọn, có citation và đúng một đáp án đúng; Student phải chấp nhận trước khi làm; attempt/answer/result thuộc đúng owner và Java chấm điểm idempotent.</w:t>
             </w:r>
           </w:p>
         </w:tc>
@@ -5484,7 +5484,7 @@
           <w:rFonts w:ascii="Times New Roman" w:hAnsi="Times New Roman"/>
           <w:sz w:val="24"/>
         </w:rPr>
-        <w:t>2) Student vào Tài liệu cá nhân → upload PDF/DOCX → chờ xử lý → chọn tài liệu → hỏi Chatbot AI và nhận câu trả lời có citation.</w:t>
+        <w:t>2) Student vào Tài liệu cá nhân → upload PDF → chờ xử lý → chọn tài liệu → hỏi Chatbot AI và nhận câu trả lời có citation.</w:t>
       </w:r>
     </w:p>
     <w:p>
@@ -5516,7 +5516,7 @@
         <w:spacing w:after="100" w:line="276" w:lineRule="auto"/>
       </w:pPr>
       <w:r>
-        <w:t>6) Vào Ôn thi → tạo kỳ thi và nội dung cần ôn → xem countdown/tiến độ → làm Mock Exam → hệ thống lưu attempt, câu trả lời và kết quả.</w:t>
+        <w:t>6) Tại chatbot Tài liệu cá nhân, Student chọn tài liệu và tạo Quiz → vào Ôn tập xem Quiz Chờ duyệt → kiểm tra câu hỏi/nguồn → chấp nhận → làm Quiz READY → xem kết quả do Java chấm.</w:t>
       </w:r>
     </w:p>
     <w:p>
@@ -5542,7 +5542,7 @@
         <w:spacing w:after="100" w:line="276" w:lineRule="auto"/>
       </w:pPr>
       <w:r>
-        <w:t>Sau 12 tuần, nhóm hoàn thiện nền tảng hỗ trợ học thuật và ôn luyện gồm quản lý lớp - môn - học liệu, tài liệu cá nhân, tiến độ &amp; thống kê, kế hoạch &amp; lịch và ôn thi. Teacher quản lý kho học liệu và public tài liệu cho lớp/môn được phân công; Student có chatbot RAG riêng cho PDF/DOCX cá nhân; AI Tutor trong học liệu lớp chỉ xuất hiện khi xem Slide. Admin quản trị người dùng, lớp học, môn học và phân công Teacher.</w:t>
+        <w:t>Sau 12 tuần, nhóm hoàn thiện nền tảng hỗ trợ học thuật và ôn luyện gồm quản lý lớp - môn - học liệu, tài liệu cá nhân, tiến độ &amp; thống kê, kế hoạch &amp; lịch và ôn tập bằng Quiz AI. Teacher quản lý kho học liệu và public tài liệu cho lớp/môn được phân công; Student có chatbot RAG riêng cho PDF cá nhân, tạo/duyệt/làm Quiz và dùng AI Tutor khi xem Slide. Admin quản trị người dùng, lớp học, môn học và phân công Teacher.</w:t>
       </w:r>
     </w:p>
     <w:p>
@@ -5569,7 +5569,7 @@
           <w:rFonts w:ascii="Times New Roman" w:hAnsi="Times New Roman"/>
           <w:sz w:val="24"/>
         </w:rPr>
-        <w:t>• Tài liệu cá nhân của Student là khu vực riêng, chỉ cho phép upload PDF và DOCX.</w:t>
+        <w:t>• Tài liệu cá nhân của Student là khu vực riêng, chỉ cho phép upload PDF.</w:t>
       </w:r>
     </w:p>
     <w:p>
@@ -5592,7 +5592,12 @@
     </w:p>
     <w:p>
       <w:r>
-        <w:t>• Trong Tài liệu của môn học, Slide/PPTX được sắp xếp trước PDF. Slide chỉ xem trực tiếp trên web, không cho tải xuống; khi xem Slide có Note và AI Tutor. PDF chỉ nằm trong danh sách Tài liệu để tải xuống, không xem trên web, không có Note và không áp dụng AI Tutor. Giới hạn PDF/DOCX chỉ áp dụng cho Personal Documents do Student tự upload.</w:t>
+        <w:t>• Trong Tài liệu của môn học, Slide/PPTX được sắp xếp trước PDF. Slide chỉ xem trực tiếp trên web, không cho tải file gốc; khi xem Slide có Note và AI Tutor. PDF Teacher chỉ có action tải xuống, không có viewer, Note hoặc AI Tutor. Personal Documents của Student chỉ nhận PDF và được tách khỏi học liệu Teacher.</w:t>
+      </w:r>
+    </w:p>
+    <w:p>
+      <w:r>
+        <w:t>Quyết định định dạng ngày 22/09/2026: Teacher upload/public PPTX và PDF. Student xem PPTX, ghi chú cá nhân và dùng Slide Tutor; PDF Teacher public chỉ tải xuống, không viewer/Note/Tutor hoặc page progress. Student chỉ upload Personal PDF có lớp văn bản để dùng RAG và sinh Quiz. Không nhận DOCX trong MVP; PDF scan cần OCR được để Future Work. Citation dùng pageNumber cho Personal PDF và slideNumber cho PPTX. Contract chi tiết theo docs/specification.md, docs/api-plan.md và docs/specs/08-traceability.md.</w:t>
       </w:r>
     </w:p>
     <w:sectPr>

</xml_diff>